<commit_message>
Add Entra ID administration at JET to Rituals CV and skill facts
Co-authored-by: clintonherring <clintonherring@users.noreply.github.com>
</commit_message>
<xml_diff>
--- a/skills/custom/clinton-cv/assets/Clinton_Herring_Rituals_Retail_Tech_Architect_CV.docx
+++ b/skills/custom/clinton-cv/assets/Clinton_Herring_Rituals_Retail_Tech_Architect_CV.docx
@@ -48,7 +48,7 @@
         </w:rPr>
         <w:t xml:space="preserve">Almere (near Amsterdam)  ·  +31 6 27517972  ·  Clinton.herring@remoteconsulting.eu  ·  </w:t>
       </w:r>
-      <w:hyperlink w:history="1" r:id="rIdgznoxbbxezdnigypvc_t1">
+      <w:hyperlink w:history="1" r:id="rId4hcqur5ls4v9uc3nnm0ur">
         <w:r>
           <w:rPr>
             <w:u w:val="single"/>
@@ -303,16 +303,16 @@
           <w:szCs w:val="20"/>
           <w:rFonts w:ascii="Calibri" w:cs="Calibri" w:eastAsia="Calibri" w:hAnsi="Calibri"/>
         </w:rPr>
-        <w:t xml:space="preserve">Cloud and AI-assisted operations. </w:t>
-      </w:r>
-      <w:r>
-        <w:rPr>
-          <w:color w:val="1A2332"/>
-          <w:sz w:val="20"/>
-          <w:szCs w:val="20"/>
-          <w:rFonts w:ascii="Calibri" w:cs="Calibri" w:eastAsia="Calibri" w:hAnsi="Calibri"/>
-        </w:rPr>
-        <w:t xml:space="preserve">Azure (Network Engineer Associate) and AWS since 2016; building AI agent tooling that codifies incident investigation and change review.</w:t>
+        <w:t xml:space="preserve">Cloud, identity and AI-assisted operations. </w:t>
+      </w:r>
+      <w:r>
+        <w:rPr>
+          <w:color w:val="1A2332"/>
+          <w:sz w:val="20"/>
+          <w:szCs w:val="20"/>
+          <w:rFonts w:ascii="Calibri" w:cs="Calibri" w:eastAsia="Calibri" w:hAnsi="Calibri"/>
+        </w:rPr>
+        <w:t xml:space="preserve">Azure (Network Engineer Associate) and AWS since 2016; Entra ID administration for internal users at Just Eat Takeaway; building AI agent tooling that codifies incident investigation and change review.</w:t>
       </w:r>
     </w:p>
     <w:p>
@@ -463,6 +463,25 @@
           <w:rFonts w:ascii="Calibri" w:cs="Calibri" w:eastAsia="Calibri" w:hAnsi="Calibri"/>
         </w:rPr>
         <w:t xml:space="preserve">Built reusable AI agent skills that encode investigation runbooks, incident patterns and change-review checks, so recurring issues are diagnosed faster and fixed structurally rather than repeatedly.</w:t>
+      </w:r>
+    </w:p>
+    <w:p>
+      <w:pPr>
+        <w:pStyle w:val="ListParagraph"/>
+        <w:numPr>
+          <w:ilvl w:val="0"/>
+          <w:numId w:val="2"/>
+        </w:numPr>
+        <w:spacing w:after="40" w:line="276"/>
+      </w:pPr>
+      <w:r>
+        <w:rPr>
+          <w:color w:val="1A2332"/>
+          <w:sz w:val="20"/>
+          <w:szCs w:val="20"/>
+          <w:rFonts w:ascii="Calibri" w:cs="Calibri" w:eastAsia="Calibri" w:hAnsi="Calibri"/>
+        </w:rPr>
+        <w:t xml:space="preserve">Managed Entra ID for internal users for about a year, until identity (Entra, network access, Okta) was consolidated from separate departments into one.</w:t>
       </w:r>
     </w:p>
     <w:p>

</xml_diff>

<commit_message>
Record Suitsupply end date (13 October 2024)
Co-authored-by: clintonherring <clintonherring@users.noreply.github.com>
</commit_message>
<xml_diff>
--- a/skills/custom/clinton-cv/assets/Clinton_Herring_Rituals_Retail_Tech_Architect_CV.docx
+++ b/skills/custom/clinton-cv/assets/Clinton_Herring_Rituals_Retail_Tech_Architect_CV.docx
@@ -48,7 +48,7 @@
         </w:rPr>
         <w:t xml:space="preserve">Almere (near Amsterdam)  ·  +31 6 27517972  ·  Clinton.herring@remoteconsulting.eu  ·  </w:t>
       </w:r>
-      <w:hyperlink w:history="1" r:id="rId4hcqur5ls4v9uc3nnm0ur">
+      <w:hyperlink w:history="1" r:id="rIdjeak6zwqhccelad8p8e8c">
         <w:r>
           <w:rPr>
             <w:u w:val="single"/>
@@ -538,7 +538,7 @@
           <w:szCs w:val="19"/>
           <w:rFonts w:ascii="Calibri" w:cs="Calibri" w:eastAsia="Calibri" w:hAnsi="Calibri"/>
         </w:rPr>
-        <w:t xml:space="preserve">	2022 – 2024</w:t>
+        <w:t xml:space="preserve">	2022 – Oct 2024</w:t>
       </w:r>
     </w:p>
     <w:p>

</xml_diff>

<commit_message>
Frame 2022-present as self-employed with Suitsupply as CGI sub-contract (second retailer)
Co-authored-by: clintonherring <clintonherring@users.noreply.github.com>
</commit_message>
<xml_diff>
--- a/skills/custom/clinton-cv/assets/Clinton_Herring_Rituals_Retail_Tech_Architect_CV.docx
+++ b/skills/custom/clinton-cv/assets/Clinton_Herring_Rituals_Retail_Tech_Architect_CV.docx
@@ -48,7 +48,7 @@
         </w:rPr>
         <w:t xml:space="preserve">Almere (near Amsterdam)  ·  +31 6 27517972  ·  Clinton.herring@remoteconsulting.eu  ·  </w:t>
       </w:r>
-      <w:hyperlink w:history="1" r:id="rIdjeak6zwqhccelad8p8e8c">
+      <w:hyperlink w:history="1" r:id="rIdpz3z-_nskylccsw6j7dz8">
         <w:r>
           <w:rPr>
             <w:u w:val="single"/>
@@ -111,7 +111,7 @@
           <w:szCs w:val="20"/>
           <w:rFonts w:ascii="Calibri" w:cs="Calibri" w:eastAsia="Calibri" w:hAnsi="Calibri"/>
         </w:rPr>
-        <w:t xml:space="preserve">Retail technology architect with 20+ years in infrastructure: 15 years owning network architecture and third-party vendors at South Africa’s largest private asset manager, then multi-vendor retail store estates with CGI, Suitsupply and the Rituals supplier landscape. I set the standards, lifecycle and designs that keep Meraki networking, iPad POS, payment terminals and back-office devices supportable, and I hold partners to them. Currently a platform engineer at Just Eat Takeaway, where I root-cause production incidents and build AI-assisted tooling that turns recurring operational issues into structural fixes.</w:t>
+        <w:t xml:space="preserve">Retail technology architect with 20+ years in infrastructure: 15 years owning network architecture and third-party vendors at South Africa’s largest private asset manager, then multi-vendor retail store estates for two retailers — the Rituals landscape with CGI, and Suitsupply as a CGI sub-contractor. I set the standards, lifecycle and designs that keep Meraki networking, iPad POS, payment terminals and back-office devices supportable, and I hold partners to them. Currently a platform engineer at Just Eat Takeaway, where I root-cause production incidents and build AI-assisted tooling that turns recurring operational issues into structural fixes.</w:t>
       </w:r>
     </w:p>
     <w:p>
@@ -352,7 +352,7 @@
           <w:szCs w:val="21"/>
           <w:rFonts w:ascii="Calibri" w:cs="Calibri" w:eastAsia="Calibri" w:hAnsi="Calibri"/>
         </w:rPr>
-        <w:t xml:space="preserve">Independent Consultant</w:t>
+        <w:t xml:space="preserve">Self-employed — Principal Architect / Platform Engineer</w:t>
       </w:r>
       <w:r>
         <w:rPr>
@@ -361,7 +361,7 @@
           <w:szCs w:val="21"/>
           <w:rFonts w:ascii="Calibri" w:cs="Calibri" w:eastAsia="Calibri" w:hAnsi="Calibri"/>
         </w:rPr>
-        <w:t xml:space="preserve">  |  Remoteconsulting.EU (own ZZP)</w:t>
+        <w:t xml:space="preserve">  |  Remoteconsulting.EU</w:t>
       </w:r>
       <w:r>
         <w:rPr>
@@ -386,7 +386,7 @@
           <w:szCs w:val="20"/>
           <w:rFonts w:ascii="Calibri" w:cs="Calibri" w:eastAsia="Calibri" w:hAnsi="Calibri"/>
         </w:rPr>
-        <w:t xml:space="preserve">Sole-proprietor vehicle for the engagements below. Also runs own Azure and DigitalOcean monitoring platforms and advises smaller retail, solar and financial-services clients on security maturity (C2M2) and cloud/DC/WAN design under ITSM change control.</w:t>
+        <w:t xml:space="preserve">Working for myself as a sole proprietor (ZZP). Engagements have included sub-contracting to CGI for Suitsupply, platform engineering at Just Eat Takeaway, and architecture, monitoring and security-maturity (C2M2) work for smaller retail, solar and financial-services clients on my own Azure and DigitalOcean platforms.</w:t>
       </w:r>
     </w:p>
     <w:p>
@@ -529,7 +529,7 @@
           <w:szCs w:val="20"/>
           <w:rFonts w:ascii="Calibri" w:cs="Calibri" w:eastAsia="Calibri" w:hAnsi="Calibri"/>
         </w:rPr>
-        <w:t xml:space="preserve">  |  Suitsupply (contracted through CGI)</w:t>
+        <w:t xml:space="preserve">  |  Suitsupply, as sub-contractor to CGI</w:t>
       </w:r>
       <w:r>
         <w:rPr>
@@ -557,26 +557,26 @@
           <w:szCs w:val="20"/>
           <w:rFonts w:ascii="Calibri" w:cs="Calibri" w:eastAsia="Calibri" w:hAnsi="Calibri"/>
         </w:rPr>
-        <w:t xml:space="preserve">Store-technology architecture for an international branded retailer, continuing the CGI store-estate model as a sole proprietor under CGI contract.</w:t>
-      </w:r>
-    </w:p>
-    <w:p>
-      <w:pPr>
-        <w:pStyle w:val="ListParagraph"/>
-        <w:numPr>
-          <w:ilvl w:val="0"/>
-          <w:numId w:val="2"/>
-        </w:numPr>
-        <w:spacing w:after="40" w:line="276"/>
-      </w:pPr>
-      <w:r>
-        <w:rPr>
-          <w:color w:val="1A2332"/>
-          <w:sz w:val="20"/>
-          <w:szCs w:val="20"/>
-          <w:rFonts w:ascii="Calibri" w:cs="Calibri" w:eastAsia="Calibri" w:hAnsi="Calibri"/>
-        </w:rPr>
-        <w:t xml:space="preserve">Standards, supportability and supplier coordination across store networking and POS-adjacent infrastructure.</w:t>
+        <w:t xml:space="preserve">Store-technology architecture for a second international retailer, so my retail experience is not limited to the Rituals landscape.</w:t>
+      </w:r>
+    </w:p>
+    <w:p>
+      <w:pPr>
+        <w:pStyle w:val="ListParagraph"/>
+        <w:numPr>
+          <w:ilvl w:val="0"/>
+          <w:numId w:val="2"/>
+        </w:numPr>
+        <w:spacing w:after="40" w:line="276"/>
+      </w:pPr>
+      <w:r>
+        <w:rPr>
+          <w:color w:val="1A2332"/>
+          <w:sz w:val="20"/>
+          <w:szCs w:val="20"/>
+          <w:rFonts w:ascii="Calibri" w:cs="Calibri" w:eastAsia="Calibri" w:hAnsi="Calibri"/>
+        </w:rPr>
+        <w:t xml:space="preserve">Standards, supportability and supplier coordination across store networking and POS-adjacent infrastructure, continuing the CGI store-estate model.</w:t>
       </w:r>
     </w:p>
     <w:p>

</xml_diff>

<commit_message>
Correct SAR app hosting: Docker on a VPS, not Azure
Co-authored-by: clintonherring <clintonherring@users.noreply.github.com>
</commit_message>
<xml_diff>
--- a/skills/custom/clinton-cv/assets/Clinton_Herring_Rituals_Retail_Tech_Architect_CV.docx
+++ b/skills/custom/clinton-cv/assets/Clinton_Herring_Rituals_Retail_Tech_Architect_CV.docx
@@ -48,7 +48,7 @@
         </w:rPr>
         <w:t xml:space="preserve">Almere (near Amsterdam)  ·  +31 6 27517972  ·  Clinton.herring@remoteconsulting.eu  ·  </w:t>
       </w:r>
-      <w:hyperlink w:history="1" r:id="rIdztmz4-werubsvx2hykpx8">
+      <w:hyperlink w:history="1" r:id="rIdvsjtkrm5i5vdtcurbt8aq">
         <w:r>
           <w:rPr>
             <w:u w:val="single"/>
@@ -1221,7 +1221,7 @@
           <w:szCs w:val="20"/>
           <w:rFonts w:ascii="Calibri" w:cs="Calibri" w:eastAsia="Calibri" w:hAnsi="Calibri"/>
         </w:rPr>
-        <w:t xml:space="preserve">I fly and build multirotor UAS (commercial RPL in South Africa, registered operator in NL). I am a keen hiker and am building a search and rescue vision system on Azure with the DJI platform to help find lost hikers.</w:t>
+        <w:t xml:space="preserve">I fly and build multirotor UAS (commercial RPL in South Africa, registered operator in NL). I am a keen hiker and am building a search and rescue vision app, running in Docker on a VPS, that works with the DJI platform to help find lost hikers.</w:t>
       </w:r>
     </w:p>
     <w:sectPr>

</xml_diff>